<commit_message>
CLASE FIN TEMA 1 20SEP 11.52
</commit_message>
<xml_diff>
--- a/TEMA 1/ACT-1 Consola Web_enunciado - ACM.docx
+++ b/TEMA 1/ACT-1 Consola Web_enunciado - ACM.docx
@@ -1125,7 +1125,7 @@
           <w:sz w:val="14"/>
         </w:rPr>
         <w:drawing>
-          <wp:anchor behindDoc="0" distT="0" distB="0" distL="0" distR="0" simplePos="0" locked="0" layoutInCell="0" allowOverlap="1" relativeHeight="44">
+          <wp:anchor behindDoc="0" distT="0" distB="0" distL="0" distR="0" simplePos="0" locked="0" layoutInCell="0" allowOverlap="1" relativeHeight="46">
             <wp:simplePos x="0" y="0"/>
             <wp:positionH relativeFrom="page">
               <wp:posOffset>638175</wp:posOffset>
@@ -1855,7 +1855,7 @@
       </w:pPr>
       <w:r>
         <w:drawing>
-          <wp:anchor behindDoc="0" distT="0" distB="0" distL="114300" distR="114300" simplePos="0" locked="0" layoutInCell="0" allowOverlap="1" relativeHeight="45">
+          <wp:anchor behindDoc="0" distT="0" distB="0" distL="114300" distR="114300" simplePos="0" locked="0" layoutInCell="0" allowOverlap="1" relativeHeight="47">
             <wp:simplePos x="0" y="0"/>
             <wp:positionH relativeFrom="column">
               <wp:posOffset>1107440</wp:posOffset>
@@ -2006,7 +2006,7 @@
           <w:sz w:val="20"/>
         </w:rPr>
         <w:drawing>
-          <wp:anchor behindDoc="0" distT="0" distB="0" distL="0" distR="0" simplePos="0" locked="0" layoutInCell="0" allowOverlap="1" relativeHeight="30">
+          <wp:anchor behindDoc="0" distT="0" distB="0" distL="0" distR="0" simplePos="0" locked="0" layoutInCell="0" allowOverlap="1" relativeHeight="32">
             <wp:simplePos x="0" y="0"/>
             <wp:positionH relativeFrom="page">
               <wp:posOffset>688340</wp:posOffset>
@@ -2493,7 +2493,7 @@
       </w:pPr>
       <w:r>
         <w:drawing>
-          <wp:anchor behindDoc="0" distT="0" distB="0" distL="0" distR="0" simplePos="0" locked="0" layoutInCell="0" allowOverlap="1" relativeHeight="31">
+          <wp:anchor behindDoc="0" distT="0" distB="0" distL="0" distR="0" simplePos="0" locked="0" layoutInCell="0" allowOverlap="1" relativeHeight="33">
             <wp:simplePos x="0" y="0"/>
             <wp:positionH relativeFrom="page">
               <wp:posOffset>2013585</wp:posOffset>
@@ -2970,34 +2970,76 @@
     </w:p>
     <w:p>
       <w:pPr>
-        <w:pStyle w:val="Cuerpodetexto"/>
-        <w:rPr>
-          <w:b w:val="false"/>
-          <w:b w:val="false"/>
+        <w:pStyle w:val="ListParagraph"/>
+        <w:numPr>
+          <w:ilvl w:val="0"/>
+          <w:numId w:val="0"/>
+        </w:numPr>
+        <w:tabs>
+          <w:tab w:val="clear" w:pos="720"/>
+          <w:tab w:val="left" w:pos="1409" w:leader="none"/>
+          <w:tab w:val="left" w:pos="1410" w:leader="none"/>
+        </w:tabs>
+        <w:spacing w:lineRule="exact" w:line="376"/>
+        <w:ind w:left="1410" w:hanging="0"/>
+        <w:rPr>
+          <w:rFonts w:ascii="Times New Roman" w:hAnsi="Times New Roman" w:eastAsia="Times New Roman" w:cs="Times New Roman"/>
           <w:i/>
           <w:i/>
-          <w:sz w:val="20"/>
-        </w:rPr>
-      </w:pPr>
-      <w:r>
-        <w:rPr>
-          <w:b w:val="false"/>
+          <w:color w:val="auto"/>
+          <w:spacing w:val="-2"/>
+          <w:kern w:val="0"/>
+          <w:sz w:val="26"/>
+          <w:szCs w:val="26"/>
+          <w:lang w:val="es-ES" w:eastAsia="en-US" w:bidi="ar-SA"/>
+        </w:rPr>
+      </w:pPr>
+      <w:r>
+        <w:rPr>
+          <w:rFonts w:eastAsia="Times New Roman" w:cs="Times New Roman"/>
           <w:i/>
-          <w:sz w:val="20"/>
+          <w:color w:val="auto"/>
+          <w:spacing w:val="-2"/>
+          <w:kern w:val="0"/>
+          <w:sz w:val="26"/>
+          <w:szCs w:val="26"/>
+          <w:lang w:val="es-ES" w:eastAsia="en-US" w:bidi="ar-SA"/>
+        </w:rPr>
+        <w:t>En ambos casos, para aplicar estilo en un mensaje en la función console, hay que añadir”%c” delante del mensaje sin espacios, y como segundo parámetro los estilos que queremos aplicar.</w:t>
+      </w:r>
+    </w:p>
+    <w:p>
+      <w:pPr>
+        <w:pStyle w:val="Cuerpodetexto"/>
+        <w:rPr>
+          <w:b w:val="false"/>
+          <w:b w:val="false"/>
+          <w:i/>
+          <w:i/>
+          <w:sz w:val="26"/>
+          <w:szCs w:val="26"/>
+        </w:rPr>
+      </w:pPr>
+      <w:r>
+        <w:rPr>
+          <w:b w:val="false"/>
+          <w:i/>
+          <w:sz w:val="26"/>
+          <w:szCs w:val="26"/>
         </w:rPr>
         <w:drawing>
-          <wp:anchor behindDoc="0" distT="0" distB="0" distL="0" distR="0" simplePos="0" locked="0" layoutInCell="0" allowOverlap="1" relativeHeight="33">
+          <wp:anchor behindDoc="0" distT="0" distB="0" distL="0" distR="0" simplePos="0" locked="0" layoutInCell="0" allowOverlap="1" relativeHeight="34">
             <wp:simplePos x="0" y="0"/>
-            <wp:positionH relativeFrom="page">
-              <wp:posOffset>4037330</wp:posOffset>
+            <wp:positionH relativeFrom="column">
+              <wp:posOffset>1125855</wp:posOffset>
             </wp:positionH>
             <wp:positionV relativeFrom="paragraph">
-              <wp:posOffset>212090</wp:posOffset>
+              <wp:posOffset>114935</wp:posOffset>
             </wp:positionV>
-            <wp:extent cx="2750820" cy="574040"/>
+            <wp:extent cx="1646555" cy="257810"/>
             <wp:effectExtent l="0" t="0" r="0" b="0"/>
             <wp:wrapTopAndBottom/>
-            <wp:docPr id="9" name="image5.jpeg" descr=""/>
+            <wp:docPr id="9" name="image4.jpeg" descr=""/>
             <wp:cNvGraphicFramePr>
               <a:graphicFrameLocks xmlns:a="http://schemas.openxmlformats.org/drawingml/2006/main" noChangeAspect="1"/>
             </wp:cNvGraphicFramePr>
@@ -3005,7 +3047,7 @@
               <a:graphicData uri="http://schemas.openxmlformats.org/drawingml/2006/picture">
                 <pic:pic xmlns:pic="http://schemas.openxmlformats.org/drawingml/2006/picture">
                   <pic:nvPicPr>
-                    <pic:cNvPr id="9" name="image5.jpeg" descr=""/>
+                    <pic:cNvPr id="9" name="image4.jpeg" descr=""/>
                     <pic:cNvPicPr>
                       <a:picLocks noChangeAspect="1" noChangeArrowheads="1"/>
                     </pic:cNvPicPr>
@@ -3019,7 +3061,7 @@
                   <pic:spPr bwMode="auto">
                     <a:xfrm>
                       <a:off x="0" y="0"/>
-                      <a:ext cx="2750820" cy="574040"/>
+                      <a:ext cx="1646555" cy="257810"/>
                     </a:xfrm>
                     <a:prstGeom prst="rect">
                       <a:avLst/>
@@ -3030,39 +3072,19 @@
             </a:graphic>
           </wp:anchor>
         </w:drawing>
-      </w:r>
-    </w:p>
-    <w:p>
-      <w:pPr>
-        <w:pStyle w:val="Cuerpodetexto"/>
-        <w:spacing w:before="8" w:after="0"/>
-        <w:rPr>
-          <w:b w:val="false"/>
-          <w:b w:val="false"/>
-          <w:i/>
-          <w:i/>
-          <w:sz w:val="12"/>
-        </w:rPr>
-      </w:pPr>
-      <w:r>
-        <w:rPr>
-          <w:b w:val="false"/>
-          <w:i/>
-          <w:sz w:val="12"/>
-        </w:rPr>
         <w:drawing>
-          <wp:anchor behindDoc="0" distT="0" distB="0" distL="0" distR="0" simplePos="0" locked="0" layoutInCell="0" allowOverlap="1" relativeHeight="32">
+          <wp:anchor behindDoc="0" distT="0" distB="0" distL="0" distR="0" simplePos="0" locked="0" layoutInCell="0" allowOverlap="1" relativeHeight="35">
             <wp:simplePos x="0" y="0"/>
-            <wp:positionH relativeFrom="page">
-              <wp:posOffset>1021080</wp:posOffset>
+            <wp:positionH relativeFrom="column">
+              <wp:posOffset>3623310</wp:posOffset>
             </wp:positionH>
             <wp:positionV relativeFrom="paragraph">
-              <wp:posOffset>354965</wp:posOffset>
+              <wp:posOffset>21590</wp:posOffset>
             </wp:positionV>
-            <wp:extent cx="1816735" cy="284480"/>
+            <wp:extent cx="2440305" cy="509270"/>
             <wp:effectExtent l="0" t="0" r="0" b="0"/>
             <wp:wrapTopAndBottom/>
-            <wp:docPr id="10" name="image4.jpeg" descr=""/>
+            <wp:docPr id="10" name="image5.jpeg" descr=""/>
             <wp:cNvGraphicFramePr>
               <a:graphicFrameLocks xmlns:a="http://schemas.openxmlformats.org/drawingml/2006/main" noChangeAspect="1"/>
             </wp:cNvGraphicFramePr>
@@ -3070,7 +3092,7 @@
               <a:graphicData uri="http://schemas.openxmlformats.org/drawingml/2006/picture">
                 <pic:pic xmlns:pic="http://schemas.openxmlformats.org/drawingml/2006/picture">
                   <pic:nvPicPr>
-                    <pic:cNvPr id="10" name="image4.jpeg" descr=""/>
+                    <pic:cNvPr id="10" name="image5.jpeg" descr=""/>
                     <pic:cNvPicPr>
                       <a:picLocks noChangeAspect="1" noChangeArrowheads="1"/>
                     </pic:cNvPicPr>
@@ -3084,7 +3106,7 @@
                   <pic:spPr bwMode="auto">
                     <a:xfrm>
                       <a:off x="0" y="0"/>
-                      <a:ext cx="1816735" cy="284480"/>
+                      <a:ext cx="2440305" cy="509270"/>
                     </a:xfrm>
                     <a:prstGeom prst="rect">
                       <a:avLst/>
@@ -3113,7 +3135,7 @@
         <w:rPr/>
         <w:drawing>
           <wp:inline distT="0" distB="0" distL="0" distR="0">
-            <wp:extent cx="4636770" cy="2588895"/>
+            <wp:extent cx="4188460" cy="2338705"/>
             <wp:effectExtent l="0" t="0" r="0" b="0"/>
             <wp:docPr id="11" name="Imagen 14" descr=""/>
             <wp:cNvGraphicFramePr>
@@ -3137,7 +3159,7 @@
                   <pic:spPr bwMode="auto">
                     <a:xfrm>
                       <a:off x="0" y="0"/>
-                      <a:ext cx="4636770" cy="2588895"/>
+                      <a:ext cx="4188460" cy="2338705"/>
                     </a:xfrm>
                     <a:prstGeom prst="rect">
                       <a:avLst/>
@@ -3393,7 +3415,7 @@
           <w:sz w:val="14"/>
         </w:rPr>
         <w:drawing>
-          <wp:anchor behindDoc="0" distT="0" distB="0" distL="0" distR="0" simplePos="0" locked="0" layoutInCell="0" allowOverlap="1" relativeHeight="34">
+          <wp:anchor behindDoc="0" distT="0" distB="0" distL="0" distR="0" simplePos="0" locked="0" layoutInCell="0" allowOverlap="1" relativeHeight="36">
             <wp:simplePos x="0" y="0"/>
             <wp:positionH relativeFrom="page">
               <wp:posOffset>933450</wp:posOffset>
@@ -3461,7 +3483,7 @@
       <w:r>
         <w:rPr/>
         <w:drawing>
-          <wp:anchor behindDoc="0" distT="0" distB="0" distL="0" distR="0" simplePos="0" locked="0" layoutInCell="0" allowOverlap="1" relativeHeight="35">
+          <wp:anchor behindDoc="0" distT="0" distB="0" distL="0" distR="0" simplePos="0" locked="0" layoutInCell="0" allowOverlap="1" relativeHeight="37">
             <wp:simplePos x="0" y="0"/>
             <wp:positionH relativeFrom="page">
               <wp:posOffset>2215515</wp:posOffset>
@@ -3611,7 +3633,7 @@
           <w:sz w:val="17"/>
         </w:rPr>
         <w:drawing>
-          <wp:anchor behindDoc="0" distT="0" distB="0" distL="0" distR="0" simplePos="0" locked="0" layoutInCell="0" allowOverlap="1" relativeHeight="36">
+          <wp:anchor behindDoc="0" distT="0" distB="0" distL="0" distR="0" simplePos="0" locked="0" layoutInCell="0" allowOverlap="1" relativeHeight="38">
             <wp:simplePos x="0" y="0"/>
             <wp:positionH relativeFrom="page">
               <wp:posOffset>685800</wp:posOffset>
@@ -3749,7 +3771,7 @@
           <w:sz w:val="17"/>
         </w:rPr>
         <w:drawing>
-          <wp:anchor behindDoc="0" distT="0" distB="0" distL="0" distR="0" simplePos="0" locked="0" layoutInCell="0" allowOverlap="1" relativeHeight="46">
+          <wp:anchor behindDoc="0" distT="0" distB="0" distL="0" distR="0" simplePos="0" locked="0" layoutInCell="0" allowOverlap="1" relativeHeight="48">
             <wp:simplePos x="0" y="0"/>
             <wp:positionH relativeFrom="column">
               <wp:align>center</wp:align>
@@ -3898,7 +3920,7 @@
           <w:sz w:val="17"/>
         </w:rPr>
         <w:drawing>
-          <wp:anchor behindDoc="0" distT="0" distB="0" distL="0" distR="0" simplePos="0" locked="0" layoutInCell="0" allowOverlap="1" relativeHeight="37">
+          <wp:anchor behindDoc="0" distT="0" distB="0" distL="0" distR="0" simplePos="0" locked="0" layoutInCell="0" allowOverlap="1" relativeHeight="39">
             <wp:simplePos x="0" y="0"/>
             <wp:positionH relativeFrom="page">
               <wp:posOffset>1141730</wp:posOffset>
@@ -3966,7 +3988,7 @@
       </w:pPr>
       <w:r>
         <w:drawing>
-          <wp:anchor behindDoc="0" distT="0" distB="0" distL="0" distR="0" simplePos="0" locked="0" layoutInCell="0" allowOverlap="1" relativeHeight="47">
+          <wp:anchor behindDoc="0" distT="0" distB="0" distL="0" distR="0" simplePos="0" locked="0" layoutInCell="0" allowOverlap="1" relativeHeight="49">
             <wp:simplePos x="0" y="0"/>
             <wp:positionH relativeFrom="column">
               <wp:align>center</wp:align>
@@ -4475,7 +4497,7 @@
           <w:sz w:val="16"/>
         </w:rPr>
         <w:drawing>
-          <wp:anchor behindDoc="0" distT="0" distB="0" distL="0" distR="0" simplePos="0" locked="0" layoutInCell="0" allowOverlap="1" relativeHeight="38">
+          <wp:anchor behindDoc="0" distT="0" distB="0" distL="0" distR="0" simplePos="0" locked="0" layoutInCell="0" allowOverlap="1" relativeHeight="40">
             <wp:simplePos x="0" y="0"/>
             <wp:positionH relativeFrom="page">
               <wp:posOffset>2006600</wp:posOffset>
@@ -4544,7 +4566,7 @@
       </w:pPr>
       <w:r>
         <w:drawing>
-          <wp:anchor behindDoc="0" distT="0" distB="0" distL="0" distR="0" simplePos="0" locked="0" layoutInCell="0" allowOverlap="1" relativeHeight="48">
+          <wp:anchor behindDoc="0" distT="0" distB="0" distL="0" distR="0" simplePos="0" locked="0" layoutInCell="0" allowOverlap="1" relativeHeight="50">
             <wp:simplePos x="0" y="0"/>
             <wp:positionH relativeFrom="column">
               <wp:align>center</wp:align>
@@ -5049,7 +5071,7 @@
       </w:r>
       <w:r>
         <w:drawing>
-          <wp:anchor behindDoc="0" distT="0" distB="0" distL="0" distR="0" simplePos="0" locked="0" layoutInCell="0" allowOverlap="1" relativeHeight="49">
+          <wp:anchor behindDoc="0" distT="0" distB="0" distL="0" distR="0" simplePos="0" locked="0" layoutInCell="0" allowOverlap="1" relativeHeight="51">
             <wp:simplePos x="0" y="0"/>
             <wp:positionH relativeFrom="column">
               <wp:align>center</wp:align>
@@ -5355,7 +5377,7 @@
           <w:lang w:val="es-ES"/>
         </w:rPr>
         <w:drawing>
-          <wp:anchor behindDoc="0" distT="0" distB="0" distL="0" distR="0" simplePos="0" locked="0" layoutInCell="0" allowOverlap="1" relativeHeight="50">
+          <wp:anchor behindDoc="0" distT="0" distB="0" distL="0" distR="0" simplePos="0" locked="0" layoutInCell="0" allowOverlap="1" relativeHeight="52">
             <wp:simplePos x="0" y="0"/>
             <wp:positionH relativeFrom="column">
               <wp:posOffset>2407920</wp:posOffset>
@@ -5560,7 +5582,7 @@
       </w:pPr>
       <w:r>
         <w:drawing>
-          <wp:anchor behindDoc="0" distT="0" distB="0" distL="0" distR="0" simplePos="0" locked="0" layoutInCell="0" allowOverlap="1" relativeHeight="39">
+          <wp:anchor behindDoc="0" distT="0" distB="0" distL="0" distR="0" simplePos="0" locked="0" layoutInCell="0" allowOverlap="1" relativeHeight="41">
             <wp:simplePos x="0" y="0"/>
             <wp:positionH relativeFrom="page">
               <wp:posOffset>308610</wp:posOffset>
@@ -5605,7 +5627,7 @@
           </wp:anchor>
         </w:drawing>
         <w:drawing>
-          <wp:anchor behindDoc="0" distT="0" distB="0" distL="0" distR="0" simplePos="0" locked="0" layoutInCell="0" allowOverlap="1" relativeHeight="40">
+          <wp:anchor behindDoc="0" distT="0" distB="0" distL="0" distR="0" simplePos="0" locked="0" layoutInCell="0" allowOverlap="1" relativeHeight="42">
             <wp:simplePos x="0" y="0"/>
             <wp:positionH relativeFrom="page">
               <wp:posOffset>4646930</wp:posOffset>
@@ -5767,18 +5789,8 @@
         </w:rPr>
       </w:pPr>
       <w:r>
-        <w:rPr>
-          <w:rFonts w:eastAsia="Times New Roman" w:cs="Times New Roman"/>
-          <w:b w:val="false"/>
-          <w:bCs w:val="false"/>
-          <w:color w:val="auto"/>
-          <w:kern w:val="0"/>
-          <w:sz w:val="26"/>
-          <w:szCs w:val="26"/>
-          <w:lang w:val="es-ES" w:eastAsia="en-US" w:bidi="ar-SA"/>
-        </w:rPr>
         <w:drawing>
-          <wp:anchor behindDoc="0" distT="0" distB="0" distL="0" distR="0" simplePos="0" locked="0" layoutInCell="0" allowOverlap="1" relativeHeight="53">
+          <wp:anchor behindDoc="0" distT="0" distB="0" distL="0" distR="0" simplePos="0" locked="0" layoutInCell="0" allowOverlap="1" relativeHeight="55">
             <wp:simplePos x="0" y="0"/>
             <wp:positionH relativeFrom="column">
               <wp:align>center</wp:align>
@@ -5965,7 +5977,7 @@
           <w:sz w:val="24"/>
         </w:rPr>
         <w:drawing>
-          <wp:anchor behindDoc="0" distT="0" distB="0" distL="0" distR="0" simplePos="0" locked="0" layoutInCell="0" allowOverlap="1" relativeHeight="41">
+          <wp:anchor behindDoc="0" distT="0" distB="0" distL="0" distR="0" simplePos="0" locked="0" layoutInCell="0" allowOverlap="1" relativeHeight="43">
             <wp:simplePos x="0" y="0"/>
             <wp:positionH relativeFrom="page">
               <wp:posOffset>762000</wp:posOffset>
@@ -6215,9 +6227,14 @@
         </w:rPr>
       </w:pPr>
       <w:r>
-        <w:rPr/>
+        <w:rPr>
+          <w:rFonts w:ascii="Trebuchet MS" w:hAnsi="Trebuchet MS"/>
+          <w:b/>
+          <w:i/>
+          <w:sz w:val="27"/>
+        </w:rPr>
         <w:drawing>
-          <wp:anchor behindDoc="0" distT="0" distB="0" distL="0" distR="0" simplePos="0" locked="0" layoutInCell="0" allowOverlap="1" relativeHeight="51">
+          <wp:anchor behindDoc="0" distT="0" distB="0" distL="0" distR="0" simplePos="0" locked="0" layoutInCell="0" allowOverlap="1" relativeHeight="53">
             <wp:simplePos x="0" y="0"/>
             <wp:positionH relativeFrom="column">
               <wp:posOffset>1488440</wp:posOffset>
@@ -6489,7 +6506,7 @@
       </w:pPr>
       <w:r>
         <w:drawing>
-          <wp:anchor behindDoc="0" distT="0" distB="0" distL="0" distR="0" simplePos="0" locked="0" layoutInCell="0" allowOverlap="1" relativeHeight="43">
+          <wp:anchor behindDoc="0" distT="0" distB="0" distL="0" distR="0" simplePos="0" locked="0" layoutInCell="0" allowOverlap="1" relativeHeight="45">
             <wp:simplePos x="0" y="0"/>
             <wp:positionH relativeFrom="page">
               <wp:posOffset>685800</wp:posOffset>
@@ -6566,7 +6583,7 @@
         <mc:AlternateContent>
           <mc:Choice Requires="wps">
             <w:drawing>
-              <wp:anchor behindDoc="1" distT="0" distB="0" distL="0" distR="0" simplePos="0" locked="0" layoutInCell="0" allowOverlap="1" relativeHeight="22">
+              <wp:anchor behindDoc="1" distT="0" distB="0" distL="0" distR="0" simplePos="0" locked="0" layoutInCell="0" allowOverlap="1" relativeHeight="30">
                 <wp:simplePos x="0" y="0"/>
                 <wp:positionH relativeFrom="page">
                   <wp:posOffset>685800</wp:posOffset>
@@ -6743,8 +6760,8 @@
           </mc:Choice>
           <mc:Fallback>
             <w:pict>
-              <v:rect id="shape_0" ID="Marco3" path="m0,0l-2147483645,0l-2147483645,-2147483646l0,-2147483646xe" fillcolor="white" stroked="f" o:allowincell="f" style="position:absolute;margin-left:54pt;margin-top:16.05pt;width:487.25pt;height:127.6pt;mso-wrap-style:square;v-text-anchor:top;mso-position-horizontal-relative:page">
-                <v:fill o:detectmouseclick="t" type="solid" color2="black" opacity="0"/>
+              <v:rect id="shape_0" ID="Marco3" path="m0,0l-2147483645,0l-2147483645,-2147483646l0,-2147483646xe" stroked="f" o:allowincell="f" style="position:absolute;margin-left:54pt;margin-top:16.05pt;width:487.25pt;height:127.6pt;mso-wrap-style:square;v-text-anchor:top;mso-position-horizontal-relative:page">
+                <v:fill o:detectmouseclick="t" on="false"/>
                 <v:stroke color="#3465a4" joinstyle="round" endcap="flat"/>
                 <v:textbox>
                   <w:txbxContent>
@@ -6977,18 +6994,8 @@
         </w:rPr>
       </w:pPr>
       <w:r>
-        <w:rPr>
-          <w:rFonts w:eastAsia="Times New Roman" w:cs="Times New Roman"/>
-          <w:b w:val="false"/>
-          <w:bCs w:val="false"/>
-          <w:color w:val="auto"/>
-          <w:kern w:val="0"/>
-          <w:sz w:val="24"/>
-          <w:szCs w:val="30"/>
-          <w:lang w:val="es-ES" w:eastAsia="en-US" w:bidi="ar-SA"/>
-        </w:rPr>
         <w:drawing>
-          <wp:anchor behindDoc="0" distT="0" distB="0" distL="0" distR="0" simplePos="0" locked="0" layoutInCell="0" allowOverlap="1" relativeHeight="52">
+          <wp:anchor behindDoc="0" distT="0" distB="0" distL="0" distR="0" simplePos="0" locked="0" layoutInCell="0" allowOverlap="1" relativeHeight="54">
             <wp:simplePos x="0" y="0"/>
             <wp:positionH relativeFrom="column">
               <wp:posOffset>658495</wp:posOffset>
@@ -7435,16 +7442,7 @@
           <w:szCs w:val="26"/>
         </w:rPr>
         <w:tab/>
-        <w:t xml:space="preserve">- </w:t>
-      </w:r>
-      <w:r>
-        <w:rPr>
-          <w:b w:val="false"/>
-          <w:bCs w:val="false"/>
-          <w:sz w:val="26"/>
-          <w:szCs w:val="26"/>
-        </w:rPr>
-        <w:t>Prueba 1: en etiqueta &lt;script&gt; dentro del c</w:t>
+        <w:t>- Prueba 1: en etiqueta &lt;script&gt; dentro del c</w:t>
       </w:r>
       <w:r>
         <w:rPr>
@@ -7469,7 +7467,7 @@
       </w:pPr>
       <w:r>
         <w:drawing>
-          <wp:anchor behindDoc="0" distT="0" distB="0" distL="0" distR="0" simplePos="0" locked="0" layoutInCell="0" allowOverlap="1" relativeHeight="54">
+          <wp:anchor behindDoc="0" distT="0" distB="0" distL="0" distR="0" simplePos="0" locked="0" layoutInCell="0" allowOverlap="1" relativeHeight="56">
             <wp:simplePos x="0" y="0"/>
             <wp:positionH relativeFrom="column">
               <wp:align>center</wp:align>
@@ -7558,18 +7556,8 @@
         </w:rPr>
       </w:pPr>
       <w:r>
-        <w:rPr>
-          <w:rFonts w:eastAsia="Times New Roman" w:cs="Times New Roman"/>
-          <w:b w:val="false"/>
-          <w:bCs w:val="false"/>
-          <w:color w:val="auto"/>
-          <w:kern w:val="0"/>
-          <w:sz w:val="26"/>
-          <w:szCs w:val="26"/>
-          <w:lang w:val="es-ES" w:eastAsia="en-US" w:bidi="ar-SA"/>
-        </w:rPr>
         <w:drawing>
-          <wp:anchor behindDoc="0" distT="0" distB="0" distL="0" distR="0" simplePos="0" locked="0" layoutInCell="0" allowOverlap="1" relativeHeight="55">
+          <wp:anchor behindDoc="0" distT="0" distB="0" distL="0" distR="0" simplePos="0" locked="0" layoutInCell="0" allowOverlap="1" relativeHeight="57">
             <wp:simplePos x="0" y="0"/>
             <wp:positionH relativeFrom="column">
               <wp:align>center</wp:align>
@@ -7674,7 +7662,7 @@
           <w:sz w:val="32"/>
         </w:rPr>
         <w:drawing>
-          <wp:anchor behindDoc="0" distT="0" distB="0" distL="0" distR="0" simplePos="0" locked="0" layoutInCell="0" allowOverlap="1" relativeHeight="56">
+          <wp:anchor behindDoc="0" distT="0" distB="0" distL="0" distR="0" simplePos="0" locked="0" layoutInCell="0" allowOverlap="1" relativeHeight="58">
             <wp:simplePos x="0" y="0"/>
             <wp:positionH relativeFrom="column">
               <wp:align>center</wp:align>
@@ -8136,7 +8124,7 @@
       <w:r>
         <w:rPr/>
         <w:drawing>
-          <wp:anchor behindDoc="0" distT="0" distB="0" distL="0" distR="0" simplePos="0" locked="0" layoutInCell="0" allowOverlap="1" relativeHeight="42">
+          <wp:anchor behindDoc="0" distT="0" distB="0" distL="0" distR="0" simplePos="0" locked="0" layoutInCell="0" allowOverlap="1" relativeHeight="44">
             <wp:simplePos x="0" y="0"/>
             <wp:positionH relativeFrom="page">
               <wp:posOffset>685800</wp:posOffset>
@@ -8201,7 +8189,7 @@
   <w:p>
     <w:pPr>
       <w:pStyle w:val="Cuerpodetexto"/>
-      <w:spacing w:lineRule="auto" w:line="9"/>
+      <w:spacing w:lineRule="auto" w:line="7"/>
       <w:rPr>
         <w:b w:val="false"/>
         <w:b w:val="false"/>
@@ -8216,7 +8204,7 @@
       <mc:AlternateContent>
         <mc:Choice Requires="wps">
           <w:drawing>
-            <wp:anchor behindDoc="1" distT="0" distB="0" distL="0" distR="0" simplePos="0" locked="0" layoutInCell="0" allowOverlap="1" relativeHeight="8">
+            <wp:anchor behindDoc="1" distT="0" distB="0" distL="0" distR="0" simplePos="0" locked="0" layoutInCell="0" allowOverlap="1" relativeHeight="12">
               <wp:simplePos x="0" y="0"/>
               <wp:positionH relativeFrom="page">
                 <wp:posOffset>3135630</wp:posOffset>
@@ -8363,8 +8351,8 @@
         </mc:Choice>
         <mc:Fallback>
           <w:pict>
-            <v:rect id="shape_0" ID="Marco2" path="m0,0l-2147483645,0l-2147483645,-2147483646l0,-2147483646xe" fillcolor="white" stroked="f" o:allowincell="f" style="position:absolute;margin-left:246.9pt;margin-top:34.15pt;width:124.65pt;height:15.25pt;mso-wrap-style:square;v-text-anchor:top;mso-position-horizontal-relative:page;mso-position-vertical-relative:page">
-              <v:fill o:detectmouseclick="t" type="solid" color2="black" opacity="0"/>
+            <v:rect id="shape_0" ID="Marco2" path="m0,0l-2147483645,0l-2147483645,-2147483646l0,-2147483646xe" stroked="f" o:allowincell="f" style="position:absolute;margin-left:246.9pt;margin-top:34.15pt;width:124.65pt;height:15.25pt;mso-wrap-style:square;v-text-anchor:top;mso-position-horizontal-relative:page;mso-position-vertical-relative:page">
+              <v:fill o:detectmouseclick="t" on="false"/>
               <v:stroke color="#3465a4" joinstyle="round" endcap="flat"/>
               <v:textbox>
                 <w:txbxContent>
@@ -8482,7 +8470,7 @@
   <w:p>
     <w:pPr>
       <w:pStyle w:val="Cuerpodetexto"/>
-      <w:spacing w:lineRule="auto" w:line="9"/>
+      <w:spacing w:lineRule="auto" w:line="7"/>
       <w:rPr>
         <w:b w:val="false"/>
         <w:b w:val="false"/>
@@ -8497,7 +8485,7 @@
       <mc:AlternateContent>
         <mc:Choice Requires="wps">
           <w:drawing>
-            <wp:anchor behindDoc="1" distT="0" distB="0" distL="0" distR="0" simplePos="0" locked="0" layoutInCell="0" allowOverlap="1" relativeHeight="12">
+            <wp:anchor behindDoc="1" distT="0" distB="0" distL="0" distR="0" simplePos="0" locked="0" layoutInCell="0" allowOverlap="1" relativeHeight="17">
               <wp:simplePos x="0" y="0"/>
               <wp:positionH relativeFrom="page">
                 <wp:posOffset>3135630</wp:posOffset>
@@ -8644,8 +8632,8 @@
         </mc:Choice>
         <mc:Fallback>
           <w:pict>
-            <v:rect id="shape_0" ID="Forma3" path="m0,0l-2147483645,0l-2147483645,-2147483646l0,-2147483646xe" fillcolor="white" stroked="f" o:allowincell="f" style="position:absolute;margin-left:246.9pt;margin-top:34.15pt;width:124.65pt;height:15.25pt;mso-wrap-style:square;v-text-anchor:top;mso-position-horizontal-relative:page;mso-position-vertical-relative:page">
-              <v:fill o:detectmouseclick="t" type="solid" color2="black" opacity="0"/>
+            <v:rect id="shape_0" ID="Forma3" path="m0,0l-2147483645,0l-2147483645,-2147483646l0,-2147483646xe" stroked="f" o:allowincell="f" style="position:absolute;margin-left:246.9pt;margin-top:34.15pt;width:124.65pt;height:15.25pt;mso-wrap-style:square;v-text-anchor:top;mso-position-horizontal-relative:page;mso-position-vertical-relative:page">
+              <v:fill o:detectmouseclick="t" on="false"/>
               <v:stroke color="#3465a4" joinstyle="round" endcap="flat"/>
               <v:textbox>
                 <w:txbxContent>
@@ -8763,7 +8751,7 @@
   <w:p>
     <w:pPr>
       <w:pStyle w:val="Cuerpodetexto"/>
-      <w:spacing w:lineRule="auto" w:line="9"/>
+      <w:spacing w:lineRule="auto" w:line="7"/>
       <w:rPr>
         <w:b w:val="false"/>
         <w:b w:val="false"/>
@@ -8778,7 +8766,7 @@
       <mc:AlternateContent>
         <mc:Choice Requires="wps">
           <w:drawing>
-            <wp:anchor behindDoc="1" distT="0" distB="0" distL="0" distR="0" simplePos="0" locked="0" layoutInCell="0" allowOverlap="1" relativeHeight="16">
+            <wp:anchor behindDoc="1" distT="0" distB="0" distL="0" distR="0" simplePos="0" locked="0" layoutInCell="0" allowOverlap="1" relativeHeight="23">
               <wp:simplePos x="0" y="0"/>
               <wp:positionH relativeFrom="page">
                 <wp:posOffset>3135630</wp:posOffset>
@@ -8925,8 +8913,8 @@
         </mc:Choice>
         <mc:Fallback>
           <w:pict>
-            <v:rect id="shape_0" ID="Forma4" path="m0,0l-2147483645,0l-2147483645,-2147483646l0,-2147483646xe" fillcolor="white" stroked="f" o:allowincell="f" style="position:absolute;margin-left:246.9pt;margin-top:34.15pt;width:124.65pt;height:15.25pt;mso-wrap-style:square;v-text-anchor:top;mso-position-horizontal-relative:page;mso-position-vertical-relative:page">
-              <v:fill o:detectmouseclick="t" type="solid" color2="black" opacity="0"/>
+            <v:rect id="shape_0" ID="Forma4" path="m0,0l-2147483645,0l-2147483645,-2147483646l0,-2147483646xe" stroked="f" o:allowincell="f" style="position:absolute;margin-left:246.9pt;margin-top:34.15pt;width:124.65pt;height:15.25pt;mso-wrap-style:square;v-text-anchor:top;mso-position-horizontal-relative:page;mso-position-vertical-relative:page">
+              <v:fill o:detectmouseclick="t" on="false"/>
               <v:stroke color="#3465a4" joinstyle="round" endcap="flat"/>
               <v:textbox>
                 <w:txbxContent>
@@ -9044,7 +9032,7 @@
   <w:p>
     <w:pPr>
       <w:pStyle w:val="Cuerpodetexto"/>
-      <w:spacing w:lineRule="auto" w:line="9"/>
+      <w:spacing w:lineRule="auto" w:line="7"/>
       <w:rPr>
         <w:b w:val="false"/>
         <w:b w:val="false"/>
@@ -9059,7 +9047,7 @@
       <mc:AlternateContent>
         <mc:Choice Requires="wps">
           <w:drawing>
-            <wp:anchor behindDoc="1" distT="0" distB="0" distL="0" distR="0" simplePos="0" locked="0" layoutInCell="0" allowOverlap="1" relativeHeight="20">
+            <wp:anchor behindDoc="1" distT="0" distB="0" distL="0" distR="0" simplePos="0" locked="0" layoutInCell="0" allowOverlap="1" relativeHeight="28">
               <wp:simplePos x="0" y="0"/>
               <wp:positionH relativeFrom="page">
                 <wp:posOffset>3135630</wp:posOffset>
@@ -9206,8 +9194,8 @@
         </mc:Choice>
         <mc:Fallback>
           <w:pict>
-            <v:rect id="shape_0" ID="Forma6" path="m0,0l-2147483645,0l-2147483645,-2147483646l0,-2147483646xe" fillcolor="white" stroked="f" o:allowincell="f" style="position:absolute;margin-left:246.9pt;margin-top:34.15pt;width:124.65pt;height:15.25pt;mso-wrap-style:square;v-text-anchor:top;mso-position-horizontal-relative:page;mso-position-vertical-relative:page">
-              <v:fill o:detectmouseclick="t" type="solid" color2="black" opacity="0"/>
+            <v:rect id="shape_0" ID="Forma6" path="m0,0l-2147483645,0l-2147483645,-2147483646l0,-2147483646xe" stroked="f" o:allowincell="f" style="position:absolute;margin-left:246.9pt;margin-top:34.15pt;width:124.65pt;height:15.25pt;mso-wrap-style:square;v-text-anchor:top;mso-position-horizontal-relative:page;mso-position-vertical-relative:page">
+              <v:fill o:detectmouseclick="t" on="false"/>
               <v:stroke color="#3465a4" joinstyle="round" endcap="flat"/>
               <v:textbox>
                 <w:txbxContent>

</xml_diff>